<commit_message>
se actualizaron requisitos funcionales
</commit_message>
<xml_diff>
--- a/casos de uso.docx
+++ b/casos de uso.docx
@@ -166,7 +166,20 @@
               <w:cnfStyle w:val="000000000000" w:firstRow="0" w:lastRow="0" w:firstColumn="0" w:lastColumn="0" w:oddVBand="0" w:evenVBand="0" w:oddHBand="0" w:evenHBand="0" w:firstRowFirstColumn="0" w:firstRowLastColumn="0" w:lastRowFirstColumn="0" w:lastRowLastColumn="0"/>
             </w:pPr>
             <w:r>
-              <w:t>El administrador deberá registrar los datos personales del empleado y credenciales de acceso el sistema validará la información y se almacenará en la base de datos.</w:t>
+              <w:t>El administrador deberá registrar los datos personales del empleado y credenciales de acceso</w:t>
+            </w:r>
+            <w:r>
+              <w:t>.</w:t>
+            </w:r>
+          </w:p>
+          <w:p>
+            <w:pPr>
+              <w:cnfStyle w:val="000000000000" w:firstRow="0" w:lastRow="0" w:firstColumn="0" w:lastColumn="0" w:oddVBand="0" w:evenVBand="0" w:oddHBand="0" w:evenHBand="0" w:firstRowFirstColumn="0" w:firstRowLastColumn="0" w:lastRowFirstColumn="0" w:lastRowLastColumn="0"/>
+            </w:pPr>
+            <w:bookmarkStart w:id="0" w:name="_GoBack"/>
+            <w:bookmarkEnd w:id="0"/>
+            <w:r>
+              <w:t>el sistema validará la información y se almacenará en la base de datos.</w:t>
             </w:r>
           </w:p>
         </w:tc>
@@ -2884,8 +2897,6 @@
             <w:r>
               <w:t xml:space="preserve">recargos, </w:t>
             </w:r>
-            <w:bookmarkStart w:id="0" w:name="_GoBack"/>
-            <w:bookmarkEnd w:id="0"/>
             <w:r>
               <w:t xml:space="preserve">permisos autorizados </w:t>
             </w:r>
@@ -5727,7 +5738,7 @@
 </file>
 
 <file path=customXml/itemProps1.xml><?xml version="1.0" encoding="utf-8"?>
-<ds:datastoreItem xmlns:ds="http://schemas.openxmlformats.org/officeDocument/2006/customXml" ds:itemID="{44DC707E-6629-4352-8023-3F16040210D5}">
+<ds:datastoreItem xmlns:ds="http://schemas.openxmlformats.org/officeDocument/2006/customXml" ds:itemID="{0283086B-9A3D-4B0A-A457-FB3FA57EB48C}">
   <ds:schemaRefs>
     <ds:schemaRef ds:uri="http://schemas.openxmlformats.org/officeDocument/2006/bibliography"/>
   </ds:schemaRefs>

</xml_diff>